<commit_message>
tutorials(W-3): the example letterhead is the firm's name alone — no logo; 21 pages; title-page option noted
Co-Authored-By: Claude Fable 5 <noreply@anthropic.com>
Claude-Session: https://claude.ai/code/session_01XjjT2aBxw8gY7EFdpoUcpj
</commit_message>
<xml_diff>
--- a/docs/tutorials/files/report_template_example.docx
+++ b/docs/tutorials/files/report_template_example.docx
@@ -58,58 +58,15 @@
   <w:tbl>
     <w:tblPr>
       <w:tblW w:type="auto" w:w="0"/>
-      <w:tblLayout w:type="fixed"/>
       <w:tblLook w:firstColumn="1" w:firstRow="1" w:lastColumn="0" w:lastRow="0" w:noHBand="0" w:noVBand="1" w:val="04A0"/>
     </w:tblPr>
     <w:tblGrid>
-      <w:gridCol w:w="4680"/>
-      <w:gridCol w:w="4680"/>
+      <w:gridCol w:w="9360"/>
     </w:tblGrid>
     <w:tr>
       <w:tc>
         <w:tcPr>
-          <w:tcW w:type="dxa" w:w="3744"/>
-        </w:tcPr>
-        <w:p>
-          <w:r>
-            <w:drawing>
-              <wp:inline xmlns:a="http://schemas.openxmlformats.org/drawingml/2006/main" xmlns:pic="http://schemas.openxmlformats.org/drawingml/2006/picture">
-                <wp:extent cx="1737360" cy="434340"/>
-                <wp:docPr id="1" name="Picture 1"/>
-                <wp:cNvGraphicFramePr>
-                  <a:graphicFrameLocks noChangeAspect="1"/>
-                </wp:cNvGraphicFramePr>
-                <a:graphic>
-                  <a:graphicData uri="http://schemas.openxmlformats.org/drawingml/2006/picture">
-                    <pic:pic>
-                      <pic:nvPicPr>
-                        <pic:cNvPr id="0" name="logo.png"/>
-                        <pic:cNvPicPr/>
-                      </pic:nvPicPr>
-                      <pic:blipFill>
-                        <a:blip r:embed="rId1"/>
-                        <a:stretch>
-                          <a:fillRect/>
-                        </a:stretch>
-                      </pic:blipFill>
-                      <pic:spPr>
-                        <a:xfrm>
-                          <a:off x="0" y="0"/>
-                          <a:ext cx="1737360" cy="434340"/>
-                        </a:xfrm>
-                        <a:prstGeom prst="rect"/>
-                      </pic:spPr>
-                    </pic:pic>
-                  </a:graphicData>
-                </a:graphic>
-              </wp:inline>
-            </w:drawing>
-          </w:r>
-        </w:p>
-      </w:tc>
-      <w:tc>
-        <w:tcPr>
-          <w:tcW w:type="dxa" w:w="5616"/>
+          <w:tcW w:type="dxa" w:w="9360"/>
         </w:tcPr>
         <w:p>
           <w:pPr>

</xml_diff>